<commit_message>
Update portfolio resume layout
</commit_message>
<xml_diff>
--- a/output/docx/Dillon_Marinez_Resume_2026.docx
+++ b/output/docx/Dillon_Marinez_Resume_2026.docx
@@ -520,77 +520,6 @@
       </w:r>
     </w:p>
     <w:p>
-      <w:r>
-        <w:rPr>
-          <w:rFonts w:ascii="Arial" w:hAnsi="Arial" w:eastAsia="Arial"/>
-        </w:rPr>
-        <w:br w:type="page"/>
-      </w:r>
-    </w:p>
-    <w:p>
-      <w:pPr>
-        <w:tabs>
-          <w:tab w:pos="10584" w:val="right"/>
-        </w:tabs>
-        <w:spacing w:after="60"/>
-        <w:pBdr>
-          <w:bottom w:val="single" w:sz="4" w:space="2" w:color="D0D3D7"/>
-        </w:pBdr>
-      </w:pPr>
-      <w:r>
-        <w:rPr>
-          <w:rFonts w:ascii="Arial" w:hAnsi="Arial" w:eastAsia="Arial"/>
-          <w:b/>
-          <w:sz w:val="18"/>
-        </w:rPr>
-        <w:t>Dillon Marinez</w:t>
-      </w:r>
-      <w:r>
-        <w:rPr>
-          <w:rFonts w:ascii="Arial" w:hAnsi="Arial" w:eastAsia="Arial"/>
-          <w:color w:val="464646"/>
-          <w:sz w:val="17"/>
-        </w:rPr>
-        <w:tab/>
-        <w:t>dillonmarinez.com</w:t>
-      </w:r>
-    </w:p>
-    <w:p>
-      <w:pPr>
-        <w:pStyle w:val="ResumeJob"/>
-        <w:tabs>
-          <w:tab w:pos="10584" w:val="right"/>
-        </w:tabs>
-      </w:pPr>
-      <w:r>
-        <w:rPr>
-          <w:rFonts w:ascii="Arial" w:hAnsi="Arial" w:eastAsia="Arial"/>
-          <w:b/>
-        </w:rPr>
-        <w:t>Capgemini America continued</w:t>
-      </w:r>
-      <w:r>
-        <w:rPr>
-          <w:rFonts w:ascii="Arial" w:hAnsi="Arial" w:eastAsia="Arial"/>
-        </w:rPr>
-        <w:t xml:space="preserve">  |  </w:t>
-      </w:r>
-      <w:r>
-        <w:rPr>
-          <w:rFonts w:ascii="Arial" w:hAnsi="Arial" w:eastAsia="Arial"/>
-          <w:b/>
-        </w:rPr>
-        <w:t>Senior Full Stack Developer</w:t>
-      </w:r>
-      <w:r>
-        <w:rPr>
-          <w:rFonts w:ascii="Arial" w:hAnsi="Arial" w:eastAsia="Arial"/>
-        </w:rPr>
-        <w:tab/>
-        <w:t>Aug 2021 - Jan 2025</w:t>
-      </w:r>
-    </w:p>
-    <w:p>
       <w:pPr>
         <w:pStyle w:val="ResumeBullet"/>
         <w:keepLines/>
@@ -682,7 +611,19 @@
         <w:rPr>
           <w:rFonts w:ascii="Arial" w:hAnsi="Arial" w:eastAsia="Arial"/>
         </w:rPr>
-        <w:t>• Led the North America pre-checkout team and clarified technical requirements and acceptance criteria for in-house and contract engineers.</w:t>
+        <w:t>• Led the North America pre-checkout team across in-house and contract engineers.</w:t>
+      </w:r>
+    </w:p>
+    <w:p>
+      <w:pPr>
+        <w:pStyle w:val="ResumeBullet"/>
+        <w:keepLines/>
+      </w:pPr>
+      <w:r>
+        <w:rPr>
+          <w:rFonts w:ascii="Arial" w:hAnsi="Arial" w:eastAsia="Arial"/>
+        </w:rPr>
+        <w:t>• Refined technical requirements and acceptance criteria so implementation work was clear and achievable.</w:t>
       </w:r>
     </w:p>
     <w:p>
@@ -741,7 +682,19 @@
         <w:rPr>
           <w:rFonts w:ascii="Arial" w:hAnsi="Arial" w:eastAsia="Arial"/>
         </w:rPr>
-        <w:t>• Integrated Salesforce Commerce Cloud with NetSuite through MuleSoft, extended email services with SendGrid, and helped scope an SFRA migration.</w:t>
+        <w:t>• Integrated Salesforce Commerce Cloud with NetSuite through MuleSoft and extended email services with SendGrid.</w:t>
+      </w:r>
+    </w:p>
+    <w:p>
+      <w:pPr>
+        <w:pStyle w:val="ResumeBullet"/>
+        <w:keepLines/>
+      </w:pPr>
+      <w:r>
+        <w:rPr>
+          <w:rFonts w:ascii="Arial" w:hAnsi="Arial" w:eastAsia="Arial"/>
+        </w:rPr>
+        <w:t>• Helped define technical requirements and scope for an SFRA migration.</w:t>
       </w:r>
     </w:p>
     <w:p>
@@ -805,6 +758,18 @@
     </w:p>
     <w:p>
       <w:pPr>
+        <w:pStyle w:val="ResumeBullet"/>
+        <w:keepLines/>
+      </w:pPr>
+      <w:r>
+        <w:rPr>
+          <w:rFonts w:ascii="Arial" w:hAnsi="Arial" w:eastAsia="Arial"/>
+        </w:rPr>
+        <w:t>• Developed and customized SFRA components for the Dynamic Catholic Institute storefront.</w:t>
+      </w:r>
+    </w:p>
+    <w:p>
+      <w:pPr>
         <w:pStyle w:val="ResumeJob"/>
         <w:tabs>
           <w:tab w:pos="10584" w:val="right"/>
@@ -859,7 +824,7 @@
         <w:rPr>
           <w:rFonts w:ascii="Arial" w:hAnsi="Arial" w:eastAsia="Arial"/>
         </w:rPr>
-        <w:t>• Built shopping tools, inventory integrations, fit guides, microsites, and interactive editorial experiences.</w:t>
+        <w:t>• Built shopping tools including Mix and Match, Locally, and a third-party retail inventory integration.</w:t>
       </w:r>
     </w:p>
     <w:p>
@@ -871,7 +836,31 @@
         <w:rPr>
           <w:rFonts w:ascii="Arial" w:hAnsi="Arial" w:eastAsia="Arial"/>
         </w:rPr>
-        <w:t>• Created publishing tools with PHP and AEM and partnered with UX, merchandising, and site teams on Optimizely experiments.</w:t>
+        <w:t>• Developed microsite experiences including fit guides and interactive editorial content.</w:t>
+      </w:r>
+    </w:p>
+    <w:p>
+      <w:pPr>
+        <w:pStyle w:val="ResumeBullet"/>
+        <w:keepLines/>
+      </w:pPr>
+      <w:r>
+        <w:rPr>
+          <w:rFonts w:ascii="Arial" w:hAnsi="Arial" w:eastAsia="Arial"/>
+        </w:rPr>
+        <w:t>• Created publishing tools with PHP and AEM to streamline landing-page updates.</w:t>
+      </w:r>
+    </w:p>
+    <w:p>
+      <w:pPr>
+        <w:pStyle w:val="ResumeBullet"/>
+        <w:keepLines/>
+      </w:pPr>
+      <w:r>
+        <w:rPr>
+          <w:rFonts w:ascii="Arial" w:hAnsi="Arial" w:eastAsia="Arial"/>
+        </w:rPr>
+        <w:t>• Partnered with UX, merchandising, and site teams on Optimizely experiments.</w:t>
       </w:r>
     </w:p>
     <w:p>
@@ -890,14 +879,17 @@
     </w:p>
     <w:p>
       <w:pPr>
-        <w:spacing w:after="30"/>
+        <w:pStyle w:val="ResumeJob"/>
+        <w:tabs>
+          <w:tab w:pos="10584" w:val="right"/>
+        </w:tabs>
       </w:pPr>
       <w:r>
         <w:rPr>
           <w:rFonts w:ascii="Arial" w:hAnsi="Arial" w:eastAsia="Arial"/>
           <w:b/>
         </w:rPr>
-        <w:t>Shopify Developer  Freelance  2020</w:t>
+        <w:t>Shopify Developer</w:t>
       </w:r>
       <w:r>
         <w:rPr>
@@ -910,7 +902,41 @@
           <w:rFonts w:ascii="Arial" w:hAnsi="Arial" w:eastAsia="Arial"/>
           <w:b/>
         </w:rPr>
-        <w:t>Metajive  Frontend Developer  2016</w:t>
+        <w:t>Freelance</w:t>
+      </w:r>
+      <w:r>
+        <w:rPr>
+          <w:rFonts w:ascii="Arial" w:hAnsi="Arial" w:eastAsia="Arial"/>
+        </w:rPr>
+        <w:tab/>
+        <w:t>May 2020</w:t>
+      </w:r>
+    </w:p>
+    <w:p>
+      <w:pPr>
+        <w:pStyle w:val="ResumeBullet"/>
+        <w:keepLines/>
+      </w:pPr>
+      <w:r>
+        <w:rPr>
+          <w:rFonts w:ascii="Arial" w:hAnsi="Arial" w:eastAsia="Arial"/>
+        </w:rPr>
+        <w:t>• Built a custom Shopify theme for Sackcloth &amp; Ashes.</w:t>
+      </w:r>
+    </w:p>
+    <w:p>
+      <w:pPr>
+        <w:pStyle w:val="ResumeJob"/>
+        <w:tabs>
+          <w:tab w:pos="10584" w:val="right"/>
+        </w:tabs>
+      </w:pPr>
+      <w:r>
+        <w:rPr>
+          <w:rFonts w:ascii="Arial" w:hAnsi="Arial" w:eastAsia="Arial"/>
+          <w:b/>
+        </w:rPr>
+        <w:t>Metajive</w:t>
       </w:r>
       <w:r>
         <w:rPr>
@@ -923,7 +949,97 @@
           <w:rFonts w:ascii="Arial" w:hAnsi="Arial" w:eastAsia="Arial"/>
           <w:b/>
         </w:rPr>
-        <w:t>Freelance Web Developer  2015 - 2016</w:t>
+        <w:t>Frontend Developer</w:t>
+      </w:r>
+      <w:r>
+        <w:rPr>
+          <w:rFonts w:ascii="Arial" w:hAnsi="Arial" w:eastAsia="Arial"/>
+        </w:rPr>
+        <w:tab/>
+        <w:t>Jan 2016 - Jun 2016</w:t>
+      </w:r>
+    </w:p>
+    <w:p>
+      <w:pPr>
+        <w:pStyle w:val="ResumeBullet"/>
+        <w:keepLines/>
+      </w:pPr>
+      <w:r>
+        <w:rPr>
+          <w:rFonts w:ascii="Arial" w:hAnsi="Arial" w:eastAsia="Arial"/>
+        </w:rPr>
+        <w:t>• Contributed to a Shopify and WordPress commerce site for Green Flash Brewing Co.</w:t>
+      </w:r>
+    </w:p>
+    <w:p>
+      <w:pPr>
+        <w:pStyle w:val="ResumeBullet"/>
+        <w:keepLines/>
+      </w:pPr>
+      <w:r>
+        <w:rPr>
+          <w:rFonts w:ascii="Arial" w:hAnsi="Arial" w:eastAsia="Arial"/>
+        </w:rPr>
+        <w:t>• Provided ongoing maintenance and development for the Alpine Beer Company website.</w:t>
+      </w:r>
+    </w:p>
+    <w:p>
+      <w:pPr>
+        <w:pStyle w:val="ResumeJob"/>
+        <w:tabs>
+          <w:tab w:pos="10584" w:val="right"/>
+        </w:tabs>
+      </w:pPr>
+      <w:r>
+        <w:rPr>
+          <w:rFonts w:ascii="Arial" w:hAnsi="Arial" w:eastAsia="Arial"/>
+          <w:b/>
+        </w:rPr>
+        <w:t>Freelance Web Developer</w:t>
+      </w:r>
+      <w:r>
+        <w:rPr>
+          <w:rFonts w:ascii="Arial" w:hAnsi="Arial" w:eastAsia="Arial"/>
+        </w:rPr>
+        <w:t xml:space="preserve">  |  </w:t>
+      </w:r>
+      <w:r>
+        <w:rPr>
+          <w:rFonts w:ascii="Arial" w:hAnsi="Arial" w:eastAsia="Arial"/>
+          <w:b/>
+        </w:rPr>
+        <w:t>Independent</w:t>
+      </w:r>
+      <w:r>
+        <w:rPr>
+          <w:rFonts w:ascii="Arial" w:hAnsi="Arial" w:eastAsia="Arial"/>
+        </w:rPr>
+        <w:tab/>
+        <w:t>2015 - 2016</w:t>
+      </w:r>
+    </w:p>
+    <w:p>
+      <w:pPr>
+        <w:pStyle w:val="ResumeBullet"/>
+        <w:keepLines/>
+      </w:pPr>
+      <w:r>
+        <w:rPr>
+          <w:rFonts w:ascii="Arial" w:hAnsi="Arial" w:eastAsia="Arial"/>
+        </w:rPr>
+        <w:t>• Developed an interactive portfolio recognized with a HOW International Design Award.</w:t>
+      </w:r>
+    </w:p>
+    <w:p>
+      <w:pPr>
+        <w:pStyle w:val="ResumeBullet"/>
+        <w:keepLines/>
+      </w:pPr>
+      <w:r>
+        <w:rPr>
+          <w:rFonts w:ascii="Arial" w:hAnsi="Arial" w:eastAsia="Arial"/>
+        </w:rPr>
+        <w:t>• Created a website for a San Diego drone-defense startup.</w:t>
       </w:r>
     </w:p>
     <w:p>
@@ -955,14 +1071,24 @@
         <w:rPr>
           <w:rFonts w:ascii="Arial" w:hAnsi="Arial" w:eastAsia="Arial"/>
         </w:rPr>
-        <w:t>FlavorFlip, CringeAI, Era Magic, EraChat</w:t>
+        <w:t>FlavorFlip  AI Recipe Generator  |  CringeAI  Social Media Analyzer</w:t>
       </w:r>
+    </w:p>
+    <w:p>
+      <w:pPr>
+        <w:spacing w:after="20"/>
+      </w:pPr>
       <w:r>
         <w:rPr>
           <w:rFonts w:ascii="Arial" w:hAnsi="Arial" w:eastAsia="Arial"/>
         </w:rPr>
-        <w:t xml:space="preserve">  |  </w:t>
+        <w:t>Era Magic  Swift Edition  |  EraChat  Swift Companion</w:t>
       </w:r>
+    </w:p>
+    <w:p>
+      <w:pPr>
+        <w:spacing w:after="20"/>
+      </w:pPr>
       <w:r>
         <w:rPr>
           <w:rFonts w:ascii="Arial" w:hAnsi="Arial" w:eastAsia="Arial"/>
@@ -974,7 +1100,18 @@
         <w:rPr>
           <w:rFonts w:ascii="Arial" w:hAnsi="Arial" w:eastAsia="Arial"/>
         </w:rPr>
-        <w:t>There Is A Light Foundation, Groove Motive Records, Sackcloth &amp; Ashes</w:t>
+        <w:t>There Is A Light Foundation  |  Groove Motive Records  |  Sackcloth &amp; Ashes</w:t>
+      </w:r>
+    </w:p>
+    <w:p>
+      <w:pPr>
+        <w:spacing w:after="20"/>
+      </w:pPr>
+      <w:r>
+        <w:rPr>
+          <w:rFonts w:ascii="Arial" w:hAnsi="Arial" w:eastAsia="Arial"/>
+        </w:rPr>
+        <w:t>Find My Color Season  |  Chize  |  Dillon Marinez</w:t>
       </w:r>
     </w:p>
     <w:p>
@@ -1029,13 +1166,56 @@
       </w:r>
     </w:p>
     <w:sectPr>
+      <w:headerReference w:type="first" r:id="rId12"/>
+      <w:headerReference w:type="default" r:id="rId13"/>
       <w:pgSz w:w="12240" w:h="15840"/>
       <w:pgMar w:top="662" w:right="792" w:bottom="662" w:left="792" w:header="346" w:footer="346" w:gutter="0"/>
       <w:cols w:space="720"/>
+      <w:titlePg/>
       <w:docGrid w:linePitch="360"/>
     </w:sectPr>
   </w:body>
 </w:document>
+</file>
+
+<file path=word/header1.xml><?xml version="1.0" encoding="utf-8"?>
+<w:hdr xmlns:m="http://schemas.openxmlformats.org/officeDocument/2006/math" xmlns:mc="http://schemas.openxmlformats.org/markup-compatibility/2006" xmlns:mo="http://schemas.microsoft.com/office/mac/office/2008/main" xmlns:mv="urn:schemas-microsoft-com:mac:vml" xmlns:o="urn:schemas-microsoft-com:office:office" xmlns:r="http://schemas.openxmlformats.org/officeDocument/2006/relationships" xmlns:v="urn:schemas-microsoft-com:vml" xmlns:w10="urn:schemas-microsoft-com:office:word" xmlns:w14="http://schemas.microsoft.com/office/word/2010/wordml" xmlns:w="http://schemas.openxmlformats.org/wordprocessingml/2006/main" xmlns:wne="http://schemas.microsoft.com/office/word/2006/wordml" xmlns:wp14="http://schemas.microsoft.com/office/word/2010/wordprocessingDrawing" xmlns:wp="http://schemas.openxmlformats.org/drawingml/2006/wordprocessingDrawing" xmlns:wpc="http://schemas.microsoft.com/office/word/2010/wordprocessingCanvas" xmlns:wpg="http://schemas.microsoft.com/office/word/2010/wordprocessingGroup" xmlns:wpi="http://schemas.microsoft.com/office/word/2010/wordprocessingInk" xmlns:wps="http://schemas.microsoft.com/office/word/2010/wordprocessingShape" mc:Ignorable="w14 wp14">
+  <w:p/>
+</w:hdr>
+</file>
+
+<file path=word/header2.xml><?xml version="1.0" encoding="utf-8"?>
+<w:hdr xmlns:m="http://schemas.openxmlformats.org/officeDocument/2006/math" xmlns:mc="http://schemas.openxmlformats.org/markup-compatibility/2006" xmlns:mo="http://schemas.microsoft.com/office/mac/office/2008/main" xmlns:mv="urn:schemas-microsoft-com:mac:vml" xmlns:o="urn:schemas-microsoft-com:office:office" xmlns:r="http://schemas.openxmlformats.org/officeDocument/2006/relationships" xmlns:v="urn:schemas-microsoft-com:vml" xmlns:w10="urn:schemas-microsoft-com:office:word" xmlns:w14="http://schemas.microsoft.com/office/word/2010/wordml" xmlns:w="http://schemas.openxmlformats.org/wordprocessingml/2006/main" xmlns:wne="http://schemas.microsoft.com/office/word/2006/wordml" xmlns:wp14="http://schemas.microsoft.com/office/word/2010/wordprocessingDrawing" xmlns:wp="http://schemas.openxmlformats.org/drawingml/2006/wordprocessingDrawing" xmlns:wpc="http://schemas.microsoft.com/office/word/2010/wordprocessingCanvas" xmlns:wpg="http://schemas.microsoft.com/office/word/2010/wordprocessingGroup" xmlns:wpi="http://schemas.microsoft.com/office/word/2010/wordprocessingInk" xmlns:wps="http://schemas.microsoft.com/office/word/2010/wordprocessingShape" mc:Ignorable="w14 wp14">
+  <w:p>
+    <w:pPr>
+      <w:tabs>
+        <w:tab w:pos="10584" w:val="right"/>
+      </w:tabs>
+      <w:spacing w:after="0"/>
+      <w:pBdr>
+        <w:bottom w:val="single" w:sz="4" w:space="2" w:color="D0D3D7"/>
+      </w:pBdr>
+    </w:pPr>
+    <w:r>
+      <w:rPr>
+        <w:rFonts w:ascii="Arial" w:hAnsi="Arial"/>
+        <w:b/>
+        <w:color w:val="000000"/>
+        <w:sz w:val="18"/>
+      </w:rPr>
+      <w:t>Dillon Marinez</w:t>
+    </w:r>
+    <w:r>
+      <w:rPr>
+        <w:rFonts w:ascii="Arial" w:hAnsi="Arial"/>
+        <w:color w:val="464646"/>
+        <w:sz w:val="17"/>
+      </w:rPr>
+      <w:tab/>
+      <w:t>dillonmarinez.com</w:t>
+    </w:r>
+  </w:p>
+</w:hdr>
 </file>
 
 <file path=word/numbering.xml><?xml version="1.0" encoding="utf-8"?>

</xml_diff>